<commit_message>
Week 5: reading homework points at the clinic MQR and the 9/27 journal date; PE 5 blurb drops 'with a rubric'; Day 1 reading is 'this week'
Co-Authored-By: Claude Opus 5 (1M context) <noreply@anthropic.com>
</commit_message>
<xml_diff>
--- a/week-5-assessment-rubrics/week-5-reading-homework.docx
+++ b/week-5-assessment-rubrics/week-5-reading-homework.docx
@@ -150,7 +150,7 @@
         <w:rPr>
           <w:rFonts w:ascii="Calibri" w:hAnsi="Calibri"/>
         </w:rPr>
-        <w:t xml:space="preserve"> What does an assessment make visible, what does it hide, and how do we use it for a learner, not just about them? McGatha sorts rubrics by what they reveal and how they weight it. Draw on McGatha, and on the rubrics you scored in the studio, as your evidence — and connect it to the child you begin profiling in the clinic.</w:t>
+        <w:t xml:space="preserve"> What does an assessment make visible, what does it hide, and how do we use it for a learner, not just about them? McGatha sorts rubrics by what they reveal and how they weight it. Draw on McGatha, and on the rubrics you scored in the studio, as your evidence — and connect it to the child's work you read in the clinic.</w:t>
       </w:r>
     </w:p>
     <w:p>
@@ -159,7 +159,7 @@
           <w:rFonts w:ascii="Calibri" w:hAnsi="Calibri"/>
           <w:i/>
         </w:rPr>
-        <w:t>This is the fifth and final entry in your Reading Journal. All five entries are due before the field week — write this one now, while the studio is fresh.</w:t>
+        <w:t>This is the fifth and final entry in your Reading Journal. All five entries are due Sunday, September 27, in Canvas, as one PDF printed from Journaler — write this one now, while the studio is fresh.</w:t>
       </w:r>
     </w:p>
     <w:sectPr>

</xml_diff>